<commit_message>
release: harden runtime and certify agency discovery
</commit_message>
<xml_diff>
--- a/public/downloads/werkcv-voorbeeld-kandidaatvoorstel-hr-adviseur-geanonimiseerd.docx
+++ b/public/downloads/werkcv-voorbeeld-kandidaatvoorstel-hr-adviseur-geanonimiseerd.docx
@@ -7,7 +7,7 @@
         <w:pStyle w:val="Subtitle"/>
       </w:pPr>
       <w:r>
-        <w:t xml:space="preserve">Voorbeeld Recruitment</w:t>
+        <w:t xml:space="preserve">Volledig fictief voorbeeld — alle namen, organisaties, vacaturegegevens en CV-inhoud zijn verzonnen.</w:t>
       </w:r>
     </w:p>
     <w:p>
@@ -23,7 +23,7 @@
         <w:pStyle w:val="Heading1"/>
       </w:pPr>
       <w:r>
-        <w:t xml:space="preserve">de kandidaat heeft zeven jaar HR-ervaring en adviseerde volgens haar CV 24 teamleiders over verzuim en medewerkerontwikkeling. Haar ervaring met AFAS, Power BI en haar exacte startdatum worden nog bevestigd.</w:t>
+        <w:t xml:space="preserve">De kandidaat heeft zeven jaar HR-ervaring en adviseerde volgens haar CV 24 teamleiders over verzuim en medewerkerontwikkeling. Haar ervaring met AFAS, Power BI en haar exacte startdatum worden nog bevestigd.</w:t>
       </w:r>
     </w:p>
     <w:p>
@@ -52,7 +52,7 @@
         <w:pStyle w:val="Caption"/>
       </w:pPr>
       <w:r>
-        <w:t xml:space="preserve">Regel 4 · CV-bron</w:t>
+        <w:t xml:space="preserve">Regel 13 · Opleiding</w:t>
       </w:r>
     </w:p>
     <w:p>
@@ -60,12 +60,12 @@
         <w:pStyle w:val="Heading2"/>
       </w:pPr>
       <w:r>
-        <w:t xml:space="preserve">Minimaal vijf jaar als zelfstandig HR-adviseur · Onderbouwd</w:t>
-      </w:r>
-    </w:p>
-    <w:p>
-      <w:r>
-        <w:t xml:space="preserve">Senior HR-adviseur met zeven jaar ervaring in verzuimbegeleiding, organisatieverandering en HR-advies.</w:t>
+        <w:t xml:space="preserve">Advies aan ten minste twintig leidinggevenden · Onderbouwd</w:t>
+      </w:r>
+    </w:p>
+    <w:p>
+      <w:r>
+        <w:t xml:space="preserve">Adviseerde 24 teamleiders over verzuim, ontwikkeling en arbeidsvoorwaarden.</w:t>
       </w:r>
     </w:p>
     <w:p>
@@ -73,49 +73,7 @@
         <w:pStyle w:val="Caption"/>
       </w:pPr>
       <w:r>
-        <w:t xml:space="preserve">Regel 1 · CV-bron</w:t>
-      </w:r>
-    </w:p>
-    <w:p>
-      <w:pPr>
-        <w:pStyle w:val="Heading2"/>
-      </w:pPr>
-      <w:r>
-        <w:t xml:space="preserve">Advies aan ten minste twintig leidinggevenden · Onderbouwd</w:t>
-      </w:r>
-    </w:p>
-    <w:p>
-      <w:r>
-        <w:t xml:space="preserve">Adviseerde 24 teamleiders over verzuim, ontwikkeling en arbeidsvoorwaarden.</w:t>
-      </w:r>
-    </w:p>
-    <w:p>
-      <w:pPr>
-        <w:pStyle w:val="Caption"/>
-      </w:pPr>
-      <w:r>
-        <w:t xml:space="preserve">Regel 2 · CV-bron</w:t>
-      </w:r>
-    </w:p>
-    <w:p>
-      <w:pPr>
-        <w:pStyle w:val="Heading2"/>
-      </w:pPr>
-      <w:r>
-        <w:t xml:space="preserve">Ervaring met complexe verzuimdossiers · Deels onderbouwd — verifiëren</w:t>
-      </w:r>
-    </w:p>
-    <w:p>
-      <w:r>
-        <w:t xml:space="preserve">Senior HR-adviseur met zeven jaar ervaring in verzuimbegeleiding, organisatieverandering en HR-advies.</w:t>
-      </w:r>
-    </w:p>
-    <w:p>
-      <w:pPr>
-        <w:pStyle w:val="Caption"/>
-      </w:pPr>
-      <w:r>
-        <w:t xml:space="preserve">Regel 1 · CV-bron</w:t>
+        <w:t xml:space="preserve">Regel 9 · Werkervaring</w:t>
       </w:r>
     </w:p>
     <w:p>
@@ -134,40 +92,29 @@
         </w:numPr>
       </w:pPr>
       <w:r>
-        <w:t xml:space="preserve">Ervaring met complexe verzuimdossiers — Handmatig beoordelen; vraag naar de specifieke wettelijke/proceservaring</w:t>
-      </w:r>
-    </w:p>
-    <w:p>
-      <w:pPr>
-        <w:numPr>
-          <w:ilvl w:val="0"/>
-          <w:numId w:val="1"/>
-        </w:numPr>
-      </w:pPr>
-      <w:r>
-        <w:t xml:space="preserve">Zelfstandig AFAS-workflows configureren — Claim verwijderen of kandidaat navragen; niet als CV-bewijs tonen</w:t>
-      </w:r>
-    </w:p>
-    <w:p>
-      <w:pPr>
-        <w:numPr>
-          <w:ilvl w:val="0"/>
-          <w:numId w:val="1"/>
-        </w:numPr>
-      </w:pPr>
-      <w:r>
-        <w:t xml:space="preserve">Beschikbaar vanaf 1 oktober — Kandidaat navragen en de bevestigde waarde apart labelen</w:t>
-      </w:r>
-    </w:p>
-    <w:p>
-      <w:pPr>
-        <w:numPr>
-          <w:ilvl w:val="0"/>
-          <w:numId w:val="1"/>
-        </w:numPr>
-      </w:pPr>
-      <w:r>
-        <w:t xml:space="preserve">HR-dashboards bouwen in Power BI — Specifieke claim verwijderen of handmatig beoordelen</w:t>
+        <w:t xml:space="preserve">Zelfstandige advieservaring en complexe verzuimdossiers — Duur en specifieke verantwoordelijkheid nog te bevestigen.</w:t>
+      </w:r>
+    </w:p>
+    <w:p>
+      <w:pPr>
+        <w:numPr>
+          <w:ilvl w:val="0"/>
+          <w:numId w:val="1"/>
+        </w:numPr>
+      </w:pPr>
+      <w:r>
+        <w:t xml:space="preserve">AFAS en Power BI — Niet aangetoond in het CV.</w:t>
+      </w:r>
+    </w:p>
+    <w:p>
+      <w:pPr>
+        <w:numPr>
+          <w:ilvl w:val="0"/>
+          <w:numId w:val="1"/>
+        </w:numPr>
+      </w:pPr>
+      <w:r>
+        <w:t xml:space="preserve">Startdatum en uren — Nog te bevestigen bij de kandidaat.</w:t>
       </w:r>
     </w:p>
     <w:tbl>
@@ -191,6 +138,28 @@
               <w:pStyle w:val="Caption"/>
             </w:pPr>
             <w:r>
+              <w:t xml:space="preserve">Beschikbaarheid</w:t>
+            </w:r>
+          </w:p>
+        </w:tc>
+        <w:tc>
+          <w:p>
+            <w:r>
+              <w:t xml:space="preserve">Nog te bevestigen</w:t>
+            </w:r>
+          </w:p>
+        </w:tc>
+      </w:tr>
+      <w:tr>
+        <w:tc>
+          <w:tcPr>
+            <w:shd w:fill="E8F8F3"/>
+          </w:tcPr>
+          <w:p>
+            <w:pPr>
+              <w:pStyle w:val="Caption"/>
+            </w:pPr>
+            <w:r>
               <w:t xml:space="preserve">Uren</w:t>
             </w:r>
           </w:p>
@@ -198,7 +167,7 @@
         <w:tc>
           <w:p>
             <w:r>
-              <w:t xml:space="preserve">32–36 uur</w:t>
+              <w:t xml:space="preserve">Nog te bevestigen</w:t>
             </w:r>
           </w:p>
         </w:tc>
@@ -220,7 +189,7 @@
         <w:tc>
           <w:p>
             <w:r>
-              <w:t xml:space="preserve">de kandidaat / hybride</w:t>
+              <w:t xml:space="preserve">Nog te bevestigen</w:t>
             </w:r>
           </w:p>
         </w:tc>
@@ -252,7 +221,7 @@
         <w:pStyle w:val="Heading2"/>
       </w:pPr>
       <w:r>
-        <w:t xml:space="preserve">Senior HR-adviseur · Fictieve Zorgdiensten · januari 2021 – heden</w:t>
+        <w:t xml:space="preserve">Senior HR-adviseur · Fictieve Zorgdiensten · januari 2023 – augustus 2026</w:t>
       </w:r>
     </w:p>
     <w:p>
@@ -276,7 +245,7 @@
         <w:pStyle w:val="Heading2"/>
       </w:pPr>
       <w:r>
-        <w:t xml:space="preserve">HR-adviseur · Middenland Services · september 2017 – december 2020</w:t>
+        <w:t xml:space="preserve">HR-adviseur · Middenland Services · september 2019 – december 2022</w:t>
       </w:r>
     </w:p>
     <w:p>
@@ -362,7 +331,74 @@
     </w:p>
     <w:p>
       <w:r>
-        <w:t xml:space="preserve">Directe contactgegevens verwijderd. Controleer bedrijfsnamen, scholen en projectdetails voordat je dit met een klant deelt.</w:t>
+        <w:t xml:space="preserve">Directe contactgegevens verwijderd. Controleer bedrijfsnamen, scholen en projectdetails. Geen garantie op anonimiteit. Volledig fictief voorbeeld.</w:t>
+      </w:r>
+    </w:p>
+    <w:p>
+      <w:pPr>
+        <w:pStyle w:val="Heading1"/>
+      </w:pPr>
+      <w:r>
+        <w:t xml:space="preserve">Talen</w:t>
+      </w:r>
+    </w:p>
+    <w:p>
+      <w:pPr>
+        <w:numPr>
+          <w:ilvl w:val="0"/>
+          <w:numId w:val="1"/>
+        </w:numPr>
+      </w:pPr>
+      <w:r>
+        <w:t xml:space="preserve">Nederlands · Moedertaal</w:t>
+      </w:r>
+    </w:p>
+    <w:p>
+      <w:pPr>
+        <w:numPr>
+          <w:ilvl w:val="0"/>
+          <w:numId w:val="1"/>
+        </w:numPr>
+      </w:pPr>
+      <w:r>
+        <w:t xml:space="preserve">Engels · Goed</w:t>
+      </w:r>
+    </w:p>
+    <w:p>
+      <w:pPr>
+        <w:pStyle w:val="Heading1"/>
+      </w:pPr>
+      <w:r>
+        <w:t xml:space="preserve">Cursussen</w:t>
+      </w:r>
+    </w:p>
+    <w:p>
+      <w:pPr>
+        <w:numPr>
+          <w:ilvl w:val="0"/>
+          <w:numId w:val="1"/>
+        </w:numPr>
+      </w:pPr>
+      <w:r>
+        <w:t xml:space="preserve">Regie op verzuim · Voorbeeld Academie · 2024</w:t>
+      </w:r>
+    </w:p>
+    <w:p>
+      <w:pPr>
+        <w:pStyle w:val="Heading1"/>
+      </w:pPr>
+      <w:r>
+        <w:t xml:space="preserve">Eigenschappen</w:t>
+      </w:r>
+    </w:p>
+    <w:p>
+      <w:r>
+        <w:t xml:space="preserve">Analytisch · Zorgvuldig · Praktisch</w:t>
+      </w:r>
+    </w:p>
+    <w:p>
+      <w:r>
+        <w:t xml:space="preserve">Rijbewijs: B</w:t>
       </w:r>
     </w:p>
     <w:sectPr>
@@ -381,7 +417,7 @@
       <w:jc w:val="center"/>
     </w:pPr>
     <w:r>
-      <w:t>Opgesteld met WerkCV MatchPack</w:t>
+      <w:t>WerkCV · volledig fictief voorbeeld</w:t>
     </w:r>
   </w:p>
 </w:ftr>

</xml_diff>